<commit_message>
Updated with AI declaration
</commit_message>
<xml_diff>
--- a/weeks/final_assessment/Final Assessment.docx
+++ b/weeks/final_assessment/Final Assessment.docx
@@ -492,11 +492,44 @@
     </w:p>
     <w:p/>
     <w:p>
-      <w:r>
+      <w:pPr>
         <w:rPr>
           <w:b/>
         </w:rPr>
+      </w:pPr>
+      <w:r>
+        <w:rPr>
+          <w:b/>
+        </w:rPr>
         <w:lastRenderedPageBreak/>
+        <w:t>AI DECLARATION</w:t>
+      </w:r>
+    </w:p>
+    <w:p>
+      <w:pPr>
+        <w:rPr>
+          <w:bCs/>
+        </w:rPr>
+      </w:pPr>
+      <w:r>
+        <w:rPr>
+          <w:bCs/>
+        </w:rPr>
+        <w:t xml:space="preserve">I can confirm that I have not used any AI in the creation of this project and documentation. </w:t>
+      </w:r>
+    </w:p>
+    <w:p>
+      <w:pPr>
+        <w:rPr>
+          <w:bCs/>
+        </w:rPr>
+      </w:pPr>
+    </w:p>
+    <w:p>
+      <w:r>
+        <w:rPr>
+          <w:b/>
+        </w:rPr>
         <w:t>REFERENCES</w:t>
       </w:r>
     </w:p>
@@ -741,6 +774,7 @@
         <w:rPr>
           <w:lang w:val="it-IT"/>
         </w:rPr>
+        <w:lastRenderedPageBreak/>
         <w:t>Modzilla</w:t>
       </w:r>
       <w:proofErr w:type="spellEnd"/>

</xml_diff>